<commit_message>
Ajoute Magdeleine Delisle au dictionnaire biographique du docx
Nouvelle section 2 (notice biographique + tableau des 9 enfants mariés
et leur postérité), sourcée sur l'article de Guy Saint-Hilaire déjà
intégré à documents/manifeste.json.

Co-Authored-By: Claude Sonnet 5 <noreply@anthropic.com>
Claude-Session: https://claude.ai/code/session_01SX7hvqrpBHARvvL59goz3Q
</commit_message>
<xml_diff>
--- a/documents/Synthese_Histoire_New_Liverpool.docx
+++ b/documents/Synthese_Histoire_New_Liverpool.docx
@@ -290,6 +290,656 @@
                 <w:sz w:val="19"/>
               </w:rPr>
               <w:t>P. McLeod, P. Honorat, C. Poiré, Abbé P.-T. Sax</w:t>
+            </w:r>
+          </w:p>
+        </w:tc>
+      </w:tr>
+    </w:tbl>
+    <w:p/>
+    <w:p>
+      <w:pPr>
+        <w:pStyle w:val="Heading1"/>
+      </w:pPr>
+      <w:r>
+        <w:rPr>
+          <w:rFonts w:ascii="Georgia" w:hAnsi="Georgia"/>
+          <w:color w:val="1B365D"/>
+        </w:rPr>
+        <w:t>2. Dictionnaire biographique</w:t>
+      </w:r>
+    </w:p>
+    <w:p>
+      <w:pPr>
+        <w:pStyle w:val="Heading2"/>
+      </w:pPr>
+      <w:r>
+        <w:rPr>
+          <w:rFonts w:ascii="Georgia" w:hAnsi="Georgia"/>
+          <w:b/>
+          <w:color w:val="1B365D"/>
+        </w:rPr>
+        <w:t>Magdeleine Delisle (1791-1873), pionnière de New Liverpool</w:t>
+      </w:r>
+    </w:p>
+    <w:p>
+      <w:r>
+        <w:rPr>
+          <w:rFonts w:ascii="Arial" w:hAnsi="Arial"/>
+          <w:i/>
+          <w:color w:val="555555"/>
+          <w:sz w:val="18"/>
+        </w:rPr>
+        <w:t>Source : Guy Saint-Hilaire, maître généalogiste agréé, « Magdeleine Delisle (1791-1873), pionnière de New Liverpool, prolifique souche des Hardy, Roberge, Gibson, Nolin, Pelletier et Forcade », L'Ancêtre, n° 292, vol. 37, automne 2010, p. 23-32.</w:t>
+      </w:r>
+    </w:p>
+    <w:p>
+      <w:pPr>
+        <w:spacing w:line="276" w:lineRule="auto"/>
+      </w:pPr>
+      <w:r>
+        <w:rPr>
+          <w:rFonts w:ascii="Arial" w:hAnsi="Arial"/>
+          <w:sz w:val="21"/>
+        </w:rPr>
+        <w:t>Née le 9 juillet 1791 à Saint-Jean-de-l'Île-d'Orléans, Magdeleine Delisle épouse Joseph Hardy en 1810 et s'établit avec lui à New Liverpool, où elle est abandonnée par son mari vers l'automne 1817 après cinq enfants. Devenue propriétaire d'une résidence en 1823, elle a par la suite six autres enfants, de trois pères différents, dont un compagnonnage d'une quinzaine d'années avec le marchand Jean Pelletier. Des onze enfants qu'elle a eus, neuf se marient et laissent une abondante descendance sous les patronymes Hardy, Burroughs (devenu Roberge par alliance), Gibson, Nolin, Pelletier et Forcade. Magdeleine Delisle meurt le 14 février 1873 à Saint-Romuald, à l'âge de 81 ans, laissant au moins 86 petits-enfants identifiés. Ses descendants Hardy, Roberge et Pelletier sont toujours représentés aujourd'hui à Saint-Romuald et dans le quartier de New Liverpool.</w:t>
+      </w:r>
+    </w:p>
+    <w:tbl>
+      <w:tblPr>
+        <w:tblW w:type="auto" w:w="0"/>
+        <w:jc w:val="center"/>
+        <w:tblLook w:firstColumn="1" w:firstRow="1" w:lastColumn="0" w:lastRow="0" w:noHBand="0" w:noVBand="1" w:val="04A0"/>
+      </w:tblPr>
+      <w:tblGrid>
+        <w:gridCol w:w="2340"/>
+        <w:gridCol w:w="2340"/>
+        <w:gridCol w:w="2340"/>
+        <w:gridCol w:w="2340"/>
+      </w:tblGrid>
+      <w:tr>
+        <w:tc>
+          <w:tcPr>
+            <w:tcW w:type="dxa" w:w="2340"/>
+            <w:shd w:fill="1B365D"/>
+          </w:tcPr>
+          <w:p>
+            <w:r>
+              <w:rPr>
+                <w:rFonts w:ascii="Arial" w:hAnsi="Arial"/>
+                <w:b/>
+                <w:color w:val="FFFFFF"/>
+              </w:rPr>
+              <w:t>Enfant</w:t>
+            </w:r>
+          </w:p>
+        </w:tc>
+        <w:tc>
+          <w:tcPr>
+            <w:tcW w:type="dxa" w:w="2340"/>
+            <w:shd w:fill="1B365D"/>
+          </w:tcPr>
+          <w:p>
+            <w:r>
+              <w:rPr>
+                <w:rFonts w:ascii="Arial" w:hAnsi="Arial"/>
+                <w:b/>
+                <w:color w:val="FFFFFF"/>
+              </w:rPr>
+              <w:t>Conjoint</w:t>
+            </w:r>
+          </w:p>
+        </w:tc>
+        <w:tc>
+          <w:tcPr>
+            <w:tcW w:type="dxa" w:w="2340"/>
+            <w:shd w:fill="1B365D"/>
+          </w:tcPr>
+          <w:p>
+            <w:r>
+              <w:rPr>
+                <w:rFonts w:ascii="Arial" w:hAnsi="Arial"/>
+                <w:b/>
+                <w:color w:val="FFFFFF"/>
+              </w:rPr>
+              <w:t>Mariage</w:t>
+            </w:r>
+          </w:p>
+        </w:tc>
+        <w:tc>
+          <w:tcPr>
+            <w:tcW w:type="dxa" w:w="2340"/>
+            <w:shd w:fill="1B365D"/>
+          </w:tcPr>
+          <w:p>
+            <w:r>
+              <w:rPr>
+                <w:rFonts w:ascii="Arial" w:hAnsi="Arial"/>
+                <w:b/>
+                <w:color w:val="FFFFFF"/>
+              </w:rPr>
+              <w:t>Postérité</w:t>
+            </w:r>
+          </w:p>
+        </w:tc>
+      </w:tr>
+      <w:tr>
+        <w:tc>
+          <w:tcPr>
+            <w:tcW w:type="dxa" w:w="2340"/>
+          </w:tcPr>
+          <w:p>
+            <w:r>
+              <w:rPr>
+                <w:rFonts w:ascii="Arial" w:hAnsi="Arial"/>
+                <w:sz w:val="18"/>
+              </w:rPr>
+              <w:t>Joseph Hardy (fils)</w:t>
+            </w:r>
+          </w:p>
+        </w:tc>
+        <w:tc>
+          <w:tcPr>
+            <w:tcW w:type="dxa" w:w="2340"/>
+          </w:tcPr>
+          <w:p>
+            <w:r>
+              <w:rPr>
+                <w:rFonts w:ascii="Arial" w:hAnsi="Arial"/>
+                <w:sz w:val="18"/>
+              </w:rPr>
+              <w:t>Aveline Fortin</w:t>
+            </w:r>
+          </w:p>
+        </w:tc>
+        <w:tc>
+          <w:tcPr>
+            <w:tcW w:type="dxa" w:w="2340"/>
+          </w:tcPr>
+          <w:p>
+            <w:r>
+              <w:rPr>
+                <w:rFonts w:ascii="Arial" w:hAnsi="Arial"/>
+                <w:sz w:val="18"/>
+              </w:rPr>
+              <w:t>14 fév. 1848, Plessisville</w:t>
+            </w:r>
+          </w:p>
+        </w:tc>
+        <w:tc>
+          <w:tcPr>
+            <w:tcW w:type="dxa" w:w="2340"/>
+          </w:tcPr>
+          <w:p>
+            <w:r>
+              <w:rPr>
+                <w:rFonts w:ascii="Arial" w:hAnsi="Arial"/>
+                <w:sz w:val="18"/>
+              </w:rPr>
+              <w:t>8 enfants</w:t>
+            </w:r>
+          </w:p>
+        </w:tc>
+      </w:tr>
+      <w:tr>
+        <w:tc>
+          <w:tcPr>
+            <w:tcW w:type="dxa" w:w="2340"/>
+          </w:tcPr>
+          <w:p>
+            <w:r>
+              <w:rPr>
+                <w:rFonts w:ascii="Arial" w:hAnsi="Arial"/>
+                <w:sz w:val="18"/>
+              </w:rPr>
+              <w:t>David Hardy</w:t>
+            </w:r>
+          </w:p>
+        </w:tc>
+        <w:tc>
+          <w:tcPr>
+            <w:tcW w:type="dxa" w:w="2340"/>
+          </w:tcPr>
+          <w:p>
+            <w:r>
+              <w:rPr>
+                <w:rFonts w:ascii="Arial" w:hAnsi="Arial"/>
+                <w:sz w:val="18"/>
+              </w:rPr>
+              <w:t>Rose-de-Lima Roberge</w:t>
+            </w:r>
+          </w:p>
+        </w:tc>
+        <w:tc>
+          <w:tcPr>
+            <w:tcW w:type="dxa" w:w="2340"/>
+          </w:tcPr>
+          <w:p>
+            <w:r>
+              <w:rPr>
+                <w:rFonts w:ascii="Arial" w:hAnsi="Arial"/>
+                <w:sz w:val="18"/>
+              </w:rPr>
+              <w:t>5 oct. 1841, St-Jean-Chrysostome</w:t>
+            </w:r>
+          </w:p>
+        </w:tc>
+        <w:tc>
+          <w:tcPr>
+            <w:tcW w:type="dxa" w:w="2340"/>
+          </w:tcPr>
+          <w:p>
+            <w:r>
+              <w:rPr>
+                <w:rFonts w:ascii="Arial" w:hAnsi="Arial"/>
+                <w:sz w:val="18"/>
+              </w:rPr>
+              <w:t>12 enfants — souche des Hardy de Saint-Romuald</w:t>
+            </w:r>
+          </w:p>
+        </w:tc>
+      </w:tr>
+      <w:tr>
+        <w:tc>
+          <w:tcPr>
+            <w:tcW w:type="dxa" w:w="2340"/>
+          </w:tcPr>
+          <w:p>
+            <w:r>
+              <w:rPr>
+                <w:rFonts w:ascii="Arial" w:hAnsi="Arial"/>
+                <w:sz w:val="18"/>
+              </w:rPr>
+              <w:t>Henriette Hardy</w:t>
+            </w:r>
+          </w:p>
+        </w:tc>
+        <w:tc>
+          <w:tcPr>
+            <w:tcW w:type="dxa" w:w="2340"/>
+          </w:tcPr>
+          <w:p>
+            <w:r>
+              <w:rPr>
+                <w:rFonts w:ascii="Arial" w:hAnsi="Arial"/>
+                <w:sz w:val="18"/>
+              </w:rPr>
+              <w:t>Télesphore Marchand</w:t>
+            </w:r>
+          </w:p>
+        </w:tc>
+        <w:tc>
+          <w:tcPr>
+            <w:tcW w:type="dxa" w:w="2340"/>
+          </w:tcPr>
+          <w:p>
+            <w:r>
+              <w:rPr>
+                <w:rFonts w:ascii="Arial" w:hAnsi="Arial"/>
+                <w:sz w:val="18"/>
+              </w:rPr>
+              <w:t>1er fév. 1848, Plessisville</w:t>
+            </w:r>
+          </w:p>
+        </w:tc>
+        <w:tc>
+          <w:tcPr>
+            <w:tcW w:type="dxa" w:w="2340"/>
+          </w:tcPr>
+          <w:p>
+            <w:r>
+              <w:rPr>
+                <w:rFonts w:ascii="Arial" w:hAnsi="Arial"/>
+                <w:sz w:val="18"/>
+              </w:rPr>
+              <w:t>6 enfants</w:t>
+            </w:r>
+          </w:p>
+        </w:tc>
+      </w:tr>
+      <w:tr>
+        <w:tc>
+          <w:tcPr>
+            <w:tcW w:type="dxa" w:w="2340"/>
+          </w:tcPr>
+          <w:p>
+            <w:r>
+              <w:rPr>
+                <w:rFonts w:ascii="Arial" w:hAnsi="Arial"/>
+                <w:sz w:val="18"/>
+              </w:rPr>
+              <w:t>Élisabeth (Isabelle) Burroughs</w:t>
+            </w:r>
+          </w:p>
+        </w:tc>
+        <w:tc>
+          <w:tcPr>
+            <w:tcW w:type="dxa" w:w="2340"/>
+          </w:tcPr>
+          <w:p>
+            <w:r>
+              <w:rPr>
+                <w:rFonts w:ascii="Arial" w:hAnsi="Arial"/>
+                <w:sz w:val="18"/>
+              </w:rPr>
+              <w:t>Hubert Roberge</w:t>
+            </w:r>
+          </w:p>
+        </w:tc>
+        <w:tc>
+          <w:tcPr>
+            <w:tcW w:type="dxa" w:w="2340"/>
+          </w:tcPr>
+          <w:p>
+            <w:r>
+              <w:rPr>
+                <w:rFonts w:ascii="Arial" w:hAnsi="Arial"/>
+                <w:sz w:val="18"/>
+              </w:rPr>
+              <w:t>21 janv. 1840, St-Jean-Chrysostome</w:t>
+            </w:r>
+          </w:p>
+        </w:tc>
+        <w:tc>
+          <w:tcPr>
+            <w:tcW w:type="dxa" w:w="2340"/>
+          </w:tcPr>
+          <w:p>
+            <w:r>
+              <w:rPr>
+                <w:rFonts w:ascii="Arial" w:hAnsi="Arial"/>
+                <w:sz w:val="18"/>
+              </w:rPr>
+              <w:t>14 enfants</w:t>
+            </w:r>
+          </w:p>
+        </w:tc>
+      </w:tr>
+      <w:tr>
+        <w:tc>
+          <w:tcPr>
+            <w:tcW w:type="dxa" w:w="2340"/>
+          </w:tcPr>
+          <w:p>
+            <w:r>
+              <w:rPr>
+                <w:rFonts w:ascii="Arial" w:hAnsi="Arial"/>
+                <w:sz w:val="18"/>
+              </w:rPr>
+              <w:t>James Gibson</w:t>
+            </w:r>
+          </w:p>
+        </w:tc>
+        <w:tc>
+          <w:tcPr>
+            <w:tcW w:type="dxa" w:w="2340"/>
+          </w:tcPr>
+          <w:p>
+            <w:r>
+              <w:rPr>
+                <w:rFonts w:ascii="Arial" w:hAnsi="Arial"/>
+                <w:sz w:val="18"/>
+              </w:rPr>
+              <w:t>Marie-Louise McReady</w:t>
+            </w:r>
+          </w:p>
+        </w:tc>
+        <w:tc>
+          <w:tcPr>
+            <w:tcW w:type="dxa" w:w="2340"/>
+          </w:tcPr>
+          <w:p>
+            <w:r>
+              <w:rPr>
+                <w:rFonts w:ascii="Arial" w:hAnsi="Arial"/>
+                <w:sz w:val="18"/>
+              </w:rPr>
+              <w:t>22 nov. 1842, St-Jean-Chrysostome</w:t>
+            </w:r>
+          </w:p>
+        </w:tc>
+        <w:tc>
+          <w:tcPr>
+            <w:tcW w:type="dxa" w:w="2340"/>
+          </w:tcPr>
+          <w:p>
+            <w:r>
+              <w:rPr>
+                <w:rFonts w:ascii="Arial" w:hAnsi="Arial"/>
+                <w:sz w:val="18"/>
+              </w:rPr>
+              <w:t>11 enfants</w:t>
+            </w:r>
+          </w:p>
+        </w:tc>
+      </w:tr>
+      <w:tr>
+        <w:tc>
+          <w:tcPr>
+            <w:tcW w:type="dxa" w:w="2340"/>
+          </w:tcPr>
+          <w:p>
+            <w:r>
+              <w:rPr>
+                <w:rFonts w:ascii="Arial" w:hAnsi="Arial"/>
+                <w:sz w:val="18"/>
+              </w:rPr>
+              <w:t>Éléonore Pelletier</w:t>
+            </w:r>
+          </w:p>
+        </w:tc>
+        <w:tc>
+          <w:tcPr>
+            <w:tcW w:type="dxa" w:w="2340"/>
+          </w:tcPr>
+          <w:p>
+            <w:r>
+              <w:rPr>
+                <w:rFonts w:ascii="Arial" w:hAnsi="Arial"/>
+                <w:sz w:val="18"/>
+              </w:rPr>
+              <w:t>Étienne Nolin, puis Victor Girouard</w:t>
+            </w:r>
+          </w:p>
+        </w:tc>
+        <w:tc>
+          <w:tcPr>
+            <w:tcW w:type="dxa" w:w="2340"/>
+          </w:tcPr>
+          <w:p>
+            <w:r>
+              <w:rPr>
+                <w:rFonts w:ascii="Arial" w:hAnsi="Arial"/>
+                <w:sz w:val="18"/>
+              </w:rPr>
+              <w:t>13 sept. 1842 / 22 fév. 1881</w:t>
+            </w:r>
+          </w:p>
+        </w:tc>
+        <w:tc>
+          <w:tcPr>
+            <w:tcW w:type="dxa" w:w="2340"/>
+          </w:tcPr>
+          <w:p>
+            <w:r>
+              <w:rPr>
+                <w:rFonts w:ascii="Arial" w:hAnsi="Arial"/>
+                <w:sz w:val="18"/>
+              </w:rPr>
+              <w:t>13 enfants</w:t>
+            </w:r>
+          </w:p>
+        </w:tc>
+      </w:tr>
+      <w:tr>
+        <w:tc>
+          <w:tcPr>
+            <w:tcW w:type="dxa" w:w="2340"/>
+          </w:tcPr>
+          <w:p>
+            <w:r>
+              <w:rPr>
+                <w:rFonts w:ascii="Arial" w:hAnsi="Arial"/>
+                <w:sz w:val="18"/>
+              </w:rPr>
+              <w:t>Édouard Pelletier</w:t>
+            </w:r>
+          </w:p>
+        </w:tc>
+        <w:tc>
+          <w:tcPr>
+            <w:tcW w:type="dxa" w:w="2340"/>
+          </w:tcPr>
+          <w:p>
+            <w:r>
+              <w:rPr>
+                <w:rFonts w:ascii="Arial" w:hAnsi="Arial"/>
+                <w:sz w:val="18"/>
+              </w:rPr>
+              <w:t>Céleste Roberge</w:t>
+            </w:r>
+          </w:p>
+        </w:tc>
+        <w:tc>
+          <w:tcPr>
+            <w:tcW w:type="dxa" w:w="2340"/>
+          </w:tcPr>
+          <w:p>
+            <w:r>
+              <w:rPr>
+                <w:rFonts w:ascii="Arial" w:hAnsi="Arial"/>
+                <w:sz w:val="18"/>
+              </w:rPr>
+              <w:t>18 sept. 1848, St-Jean-Chrysostome</w:t>
+            </w:r>
+          </w:p>
+        </w:tc>
+        <w:tc>
+          <w:tcPr>
+            <w:tcW w:type="dxa" w:w="2340"/>
+          </w:tcPr>
+          <w:p>
+            <w:r>
+              <w:rPr>
+                <w:rFonts w:ascii="Arial" w:hAnsi="Arial"/>
+                <w:sz w:val="18"/>
+              </w:rPr>
+              <w:t>11 enfants</w:t>
+            </w:r>
+          </w:p>
+        </w:tc>
+      </w:tr>
+      <w:tr>
+        <w:tc>
+          <w:tcPr>
+            <w:tcW w:type="dxa" w:w="2340"/>
+          </w:tcPr>
+          <w:p>
+            <w:r>
+              <w:rPr>
+                <w:rFonts w:ascii="Arial" w:hAnsi="Arial"/>
+                <w:sz w:val="18"/>
+              </w:rPr>
+              <w:t>Caroline Pelletier</w:t>
+            </w:r>
+          </w:p>
+        </w:tc>
+        <w:tc>
+          <w:tcPr>
+            <w:tcW w:type="dxa" w:w="2340"/>
+          </w:tcPr>
+          <w:p>
+            <w:r>
+              <w:rPr>
+                <w:rFonts w:ascii="Arial" w:hAnsi="Arial"/>
+                <w:sz w:val="18"/>
+              </w:rPr>
+              <w:t>Joseph Forcade, puis Norbert Gosselin (fils)</w:t>
+            </w:r>
+          </w:p>
+        </w:tc>
+        <w:tc>
+          <w:tcPr>
+            <w:tcW w:type="dxa" w:w="2340"/>
+          </w:tcPr>
+          <w:p>
+            <w:r>
+              <w:rPr>
+                <w:rFonts w:ascii="Arial" w:hAnsi="Arial"/>
+                <w:sz w:val="18"/>
+              </w:rPr>
+              <w:t>18 sept. 1848 / 9 janv. 1872</w:t>
+            </w:r>
+          </w:p>
+        </w:tc>
+        <w:tc>
+          <w:tcPr>
+            <w:tcW w:type="dxa" w:w="2340"/>
+          </w:tcPr>
+          <w:p>
+            <w:r>
+              <w:rPr>
+                <w:rFonts w:ascii="Arial" w:hAnsi="Arial"/>
+                <w:sz w:val="18"/>
+              </w:rPr>
+              <w:t>6 enfants</w:t>
+            </w:r>
+          </w:p>
+        </w:tc>
+      </w:tr>
+      <w:tr>
+        <w:tc>
+          <w:tcPr>
+            <w:tcW w:type="dxa" w:w="2340"/>
+          </w:tcPr>
+          <w:p>
+            <w:r>
+              <w:rPr>
+                <w:rFonts w:ascii="Arial" w:hAnsi="Arial"/>
+                <w:sz w:val="18"/>
+              </w:rPr>
+              <w:t>Eusèbe Pelletier</w:t>
+            </w:r>
+          </w:p>
+        </w:tc>
+        <w:tc>
+          <w:tcPr>
+            <w:tcW w:type="dxa" w:w="2340"/>
+          </w:tcPr>
+          <w:p>
+            <w:r>
+              <w:rPr>
+                <w:rFonts w:ascii="Arial" w:hAnsi="Arial"/>
+                <w:sz w:val="18"/>
+              </w:rPr>
+              <w:t>Marie-Émilie McReady, puis Léda Couillard, puis Eusébie Houle</w:t>
+            </w:r>
+          </w:p>
+        </w:tc>
+        <w:tc>
+          <w:tcPr>
+            <w:tcW w:type="dxa" w:w="2340"/>
+          </w:tcPr>
+          <w:p>
+            <w:r>
+              <w:rPr>
+                <w:rFonts w:ascii="Arial" w:hAnsi="Arial"/>
+                <w:sz w:val="18"/>
+              </w:rPr>
+              <w:t>20 fév. 1860, Saint-Romuald</w:t>
+            </w:r>
+          </w:p>
+        </w:tc>
+        <w:tc>
+          <w:tcPr>
+            <w:tcW w:type="dxa" w:w="2340"/>
+          </w:tcPr>
+          <w:p>
+            <w:r>
+              <w:rPr>
+                <w:rFonts w:ascii="Arial" w:hAnsi="Arial"/>
+                <w:sz w:val="18"/>
+              </w:rPr>
+              <w:t>5 enfants</w:t>
             </w:r>
           </w:p>
         </w:tc>

</xml_diff>